<commit_message>
Rebrand to THE VENTURE ORBITAL
Rename site title, headers, footers, report/email branding, AI prompts
and package name from The Conscious Orbit to The Venture Orbital.
Contact page updated with Dywebix details and Instagram link. Seeded
login emails and database identifiers left unchanged.

Co-Authored-By: Claude Fable 5 <noreply@anthropic.com>
Claude-Session: https://claude.ai/code/session_01327CRmyZTYdksmCz1hT1TJ
</commit_message>
<xml_diff>
--- a/Project-Synopsis.docx
+++ b/Project-Synopsis.docx
@@ -12,7 +12,7 @@
           <w:color w:val="1A1A1A"/>
           <w:sz w:val="56"/>
         </w:rPr>
-        <w:t>The Conscious Orbit</w:t>
+        <w:t>The Venture Orbital</w:t>
       </w:r>
     </w:p>
     <w:p>
@@ -81,7 +81,7 @@
         <w:spacing w:after="120"/>
       </w:pPr>
       <w:r>
-        <w:t>The Conscious Orbit is a full-stack platform that puts every venture through an investment-committee-grade evaluation. A founder describes their idea once through a guided three-layer intake. The platform then runs it through ten analytical engines — from customer discovery and TAM/SAM/SOM market sizing to pricing, feasibility and go-to-market readiness — each producing a transparent 0–100 score. An AI assessor audits the results, and a human administrator delivers the final verdict: GO or PIVOT. The founder receives a complete, board-ready strategy report — on screen, as a Word document, and in their inbox.</w:t>
+        <w:t>The Venture Orbital is a full-stack platform that puts every venture through an investment-committee-grade evaluation. A founder describes their idea once through a guided three-layer intake. The platform then runs it through ten analytical engines — from customer discovery and TAM/SAM/SOM market sizing to pricing, feasibility and go-to-market readiness — each producing a transparent 0–100 score. An AI assessor audits the results, and a human administrator delivers the final verdict: GO or PIVOT. The founder receives a complete, board-ready strategy report — on screen, as a Word document, and in their inbox.</w:t>
       </w:r>
     </w:p>
     <w:p>
@@ -261,7 +261,7 @@
         <w:spacing w:after="120"/>
       </w:pPr>
       <w:r>
-        <w:t>The Conscious Orbit turns venture validation from an expensive privilege into an accessible discipline — a founder anywhere can get a rigorous, evidence-graded answer to "should I build this?" before spending a rupee. The architecture is ready to grow: richer competitor data sources, multi-evaluator review panels, portfolio-level analytics across ventures, and regional brand-equity models beyond India are all natural next steps on the same gated pipeline.</w:t>
+        <w:t>The Venture Orbital turns venture validation from an expensive privilege into an accessible discipline — a founder anywhere can get a rigorous, evidence-graded answer to "should I build this?" before spending a rupee. The architecture is ready to grow: richer competitor data sources, multi-evaluator review panels, portfolio-level analytics across ventures, and regional brand-equity models beyond India are all natural next steps on the same gated pipeline.</w:t>
       </w:r>
     </w:p>
     <w:p>
@@ -282,7 +282,7 @@
         <w:spacing w:after="120"/>
       </w:pPr>
       <w:r>
-        <w:t>Most tools tell founders what they want to hear. The Conscious Orbit is built to tell them what they need to know — with the evidence to back it, the transparency to trust it, and a human making the final call.</w:t>
+        <w:t>Most tools tell founders what they want to hear. The Venture Orbital is built to tell them what they need to know — with the evidence to back it, the transparency to trust it, and a human making the final call.</w:t>
       </w:r>
     </w:p>
     <w:sectPr>

</xml_diff>

<commit_message>
Add project team to synopsis
Co-Authored-By: Claude Fable 5 <noreply@anthropic.com>
Claude-Session: https://claude.ai/code/session_01327CRmyZTYdksmCz1hT1TJ
</commit_message>
<xml_diff>
--- a/Project-Synopsis.docx
+++ b/Project-Synopsis.docx
@@ -39,6 +39,104 @@
           <w:sz w:val="24"/>
         </w:rPr>
         <w:t>Every great idea deserves a verdict backed by evidence — not enthusiasm.</w:t>
+      </w:r>
+    </w:p>
+    <w:p/>
+    <w:p>
+      <w:pPr>
+        <w:jc w:val="center"/>
+      </w:pPr>
+      <w:r>
+        <w:rPr>
+          <w:b/>
+          <w:color w:val="B88A1A"/>
+          <w:sz w:val="26"/>
+        </w:rPr>
+        <w:t>PROJECT TEAM</w:t>
+      </w:r>
+    </w:p>
+    <w:p>
+      <w:pPr>
+        <w:jc w:val="center"/>
+      </w:pPr>
+      <w:r>
+        <w:rPr>
+          <w:b/>
+          <w:color w:val="B88A1A"/>
+          <w:sz w:val="22"/>
+        </w:rPr>
+        <w:t xml:space="preserve">Project Lead:  </w:t>
+      </w:r>
+      <w:r>
+        <w:rPr>
+          <w:b/>
+          <w:color w:val="1A1A1A"/>
+          <w:sz w:val="24"/>
+        </w:rPr>
+        <w:t>MOHAMED IBRAHIM M</w:t>
+      </w:r>
+    </w:p>
+    <w:p>
+      <w:pPr>
+        <w:jc w:val="center"/>
+      </w:pPr>
+      <w:r>
+        <w:rPr>
+          <w:b/>
+          <w:color w:val="B88A1A"/>
+          <w:sz w:val="22"/>
+        </w:rPr>
+        <w:t xml:space="preserve">Assistant Project Lead:  </w:t>
+      </w:r>
+      <w:r>
+        <w:rPr>
+          <w:b/>
+          <w:color w:val="1A1A1A"/>
+          <w:sz w:val="24"/>
+        </w:rPr>
+        <w:t>MELWIN ANTO A</w:t>
+      </w:r>
+    </w:p>
+    <w:p>
+      <w:pPr>
+        <w:jc w:val="center"/>
+      </w:pPr>
+      <w:r>
+        <w:rPr>
+          <w:b/>
+          <w:color w:val="B88A1A"/>
+          <w:sz w:val="22"/>
+        </w:rPr>
+        <w:t xml:space="preserve">Member:  </w:t>
+      </w:r>
+      <w:r>
+        <w:rPr>
+          <w:b/>
+          <w:color w:val="1A1A1A"/>
+          <w:sz w:val="24"/>
+        </w:rPr>
+        <w:t>DHANIYA SRI P</w:t>
+      </w:r>
+    </w:p>
+    <w:p>
+      <w:pPr>
+        <w:jc w:val="center"/>
+      </w:pPr>
+      <w:r>
+        <w:rPr>
+          <w:b/>
+          <w:color w:val="B88A1A"/>
+          <w:sz w:val="22"/>
+        </w:rPr>
+        <w:t xml:space="preserve">Member:  </w:t>
+      </w:r>
+      <w:r>
+        <w:rPr>
+          <w:b/>
+          <w:color w:val="1A1A1A"/>
+          <w:sz w:val="24"/>
+        </w:rPr>
+        <w:t>HEMANATH K S</w:t>
       </w:r>
     </w:p>
     <w:p/>

</xml_diff>